<commit_message>
Ada Koch II: Julian quiere un origen; semilla al final del cap. 10
Co-Authored-By: Claude Opus 5.5 <noreply@anthropic.com>
Claude-Session: https://claude.ai/code/session_01HymiadRDUPzWBtequ8tm6m
</commit_message>
<xml_diff>
--- a/ada_koch/libro_2/El_hombre_de_al_lado_acto1_borrador.docx
+++ b/ada_koch/libro_2/El_hombre_de_al_lado_acto1_borrador.docx
@@ -6494,6 +6494,125 @@
       </w:pPr>
       <w:r>
         <w:t xml:space="preserve">Ya van dos.</w:t>
+      </w:r>
+    </w:p>
+    <w:p>
+      <w:r>
+        <w:pict>
+          <v:rect style="width:0;height:1.5pt" o:hralign="center" o:hrstd="t" o:hr="t"/>
+        </w:pict>
+      </w:r>
+    </w:p>
+    <w:p>
+      <w:pPr>
+        <w:pStyle w:val="FirstParagraph"/>
+      </w:pPr>
+      <w:r>
+        <w:t xml:space="preserve">A las cuatro, con Ada dormida, salí de la cama y fui a buscar el cuaderno.</w:t>
+      </w:r>
+    </w:p>
+    <w:p>
+      <w:pPr>
+        <w:pStyle w:val="BodyText"/>
+      </w:pPr>
+      <w:r>
+        <w:t xml:space="preserve">No diré dónde lo guardo. Ni aquí. Es lo único que no apunto.</w:t>
+      </w:r>
+    </w:p>
+    <w:p>
+      <w:pPr>
+        <w:pStyle w:val="BodyText"/>
+      </w:pPr>
+      <w:r>
+        <w:t xml:space="preserve">No lo había abierto desde la mañana en que ella me lo dio. Lo abrí en la cocina, con la luz pequeña de la campana, y pasé de largo las hojas donde estoy yo sin mirarlas, porque mirarlas me marea. La página del martes. La de la roca. Las que el mar le devolvió a Brais pegadas con cinta.</w:t>
+      </w:r>
+    </w:p>
+    <w:p>
+      <w:pPr>
+        <w:pStyle w:val="BodyText"/>
+      </w:pPr>
+      <w:r>
+        <w:t xml:space="preserve">Después de la última hoja donde estoy yo, el cuaderno sigue.</w:t>
+      </w:r>
+    </w:p>
+    <w:p>
+      <w:pPr>
+        <w:pStyle w:val="BodyText"/>
+      </w:pPr>
+      <w:r>
+        <w:t xml:space="preserve">En blanco.</w:t>
+      </w:r>
+    </w:p>
+    <w:p>
+      <w:pPr>
+        <w:pStyle w:val="BodyText"/>
+      </w:pPr>
+      <w:r>
+        <w:t xml:space="preserve">Las conté. Treinta y una hojas. Por las dos caras, sesenta y dos. Sesenta y dos sitios donde no hay nadie todavía.</w:t>
+      </w:r>
+    </w:p>
+    <w:p>
+      <w:pPr>
+        <w:pStyle w:val="BodyText"/>
+      </w:pPr>
+      <w:r>
+        <w:t xml:space="preserve">La mujer de Le Puy venía de mil quinientos kilómetros. El chico de Sevilla, de mil. El de la barba, de la puerta de su casa.</w:t>
+      </w:r>
+    </w:p>
+    <w:p>
+      <w:pPr>
+        <w:pStyle w:val="BodyText"/>
+      </w:pPr>
+      <w:r>
+        <w:t xml:space="preserve">Yo vengo de la página de antes.</w:t>
+      </w:r>
+    </w:p>
+    <w:p>
+      <w:pPr>
+        <w:pStyle w:val="BodyText"/>
+      </w:pPr>
+      <w:r>
+        <w:t xml:space="preserve">Pasé la mano por la primera hoja en blanco. Despacio. Como Ada pasa la mano por el papel antes de empezar, que la he visto hacerlo en sueños, aunque yo no sueño.</w:t>
+      </w:r>
+    </w:p>
+    <w:p>
+      <w:pPr>
+        <w:pStyle w:val="BodyText"/>
+      </w:pPr>
+      <w:r>
+        <w:t xml:space="preserve">No dibujé nada. No tengo lápiz. Los lápices de esta casa son de ella, y están contados.</w:t>
+      </w:r>
+    </w:p>
+    <w:p>
+      <w:pPr>
+        <w:pStyle w:val="BodyText"/>
+      </w:pPr>
+      <w:r>
+        <w:t xml:space="preserve">Guardé el cuaderno donde lo guardo. Abrí la lata de las galletas danesas. Conté los billetes.</w:t>
+      </w:r>
+    </w:p>
+    <w:p>
+      <w:pPr>
+        <w:pStyle w:val="BodyText"/>
+      </w:pPr>
+      <w:r>
+        <w:t xml:space="preserve">Cuatrocientos veinte euros.</w:t>
+      </w:r>
+    </w:p>
+    <w:p>
+      <w:pPr>
+        <w:pStyle w:val="BodyText"/>
+      </w:pPr>
+      <w:r>
+        <w:t xml:space="preserve">No sé cuánto cuesta un lápiz. Sí sé cuánto cuesta ir andando a algún sitio: nada. Solo las botas.</w:t>
+      </w:r>
+    </w:p>
+    <w:p>
+      <w:pPr>
+        <w:pStyle w:val="BodyText"/>
+      </w:pPr>
+      <w:r>
+        <w:t xml:space="preserve">Y eso también lo apunto, aunque no sepa todavía qué es.</w:t>
       </w:r>
     </w:p>
     <w:bookmarkStart w:id="38" w:name="maruxa-costa-da-morte-febrero-de-1980"/>

</xml_diff>

<commit_message>
Ada Koch II, acto I: correcciones de la revisión (cicatriz, Maruxa y Elisa, repeticiones)
Co-Authored-By: Claude Opus 5.5 <noreply@anthropic.com>
Claude-Session: https://claude.ai/code/session_01HymiadRDUPzWBtequ8tm6m
</commit_message>
<xml_diff>
--- a/ada_koch/libro_2/El_hombre_de_al_lado_acto1_borrador.docx
+++ b/ada_koch/libro_2/El_hombre_de_al_lado_acto1_borrador.docx
@@ -45,7 +45,7 @@
         <w:pStyle w:val="BodyText"/>
       </w:pPr>
       <w:r>
-        <w:t xml:space="preserve">Era el muelle, de noche, sin luna. Las farolas del puerto estaban apagadas y solo había la luz amarilla de una furgoneta con las puertas de atrás abiertas. Olía a gasoil y a algas. El agua golpeaba los pilotes debajo de mis pies con un ruido de lengua.</w:t>
+        <w:t xml:space="preserve">Era el muelle, de noche, sin luna. Las farolas del puerto estaban apagadas y solo había la luz amarilla de una furgoneta con las puertas de atrás abiertas. Olía a gasoil y a algas. Debajo de mis pies, el agua lamía los pilotes.</w:t>
       </w:r>
     </w:p>
     <w:p>
@@ -101,7 +101,7 @@
         <w:pStyle w:val="BodyText"/>
       </w:pPr>
       <w:r>
-        <w:t xml:space="preserve">Me subió en brazos como me había subido por el acantilado. Igual. Sin esfuerzo y sin pedir permiso. Y yo le rodeé la cintura con las piernas y me dejé caer sobre él, despacio, entera, hasta que no quedó aire entre los dos.</w:t>
+        <w:t xml:space="preserve">Me subió en brazos como me había subido por el acantilado. Igual. Sin esfuerzo y sin pedir permiso. Me agarré a su espalda mojada y, debajo de la palma derecha, en el omóplato, encontré una cicatriz larga, en relieve, como una costura mal hecha. Y yo le rodeé la cintura con las piernas y me dejé caer sobre él, despacio, entera, hasta que no quedó aire entre los dos.</w:t>
       </w:r>
     </w:p>
     <w:p>
@@ -839,6 +839,14 @@
         <w:pStyle w:val="BodyText"/>
       </w:pPr>
       <w:r>
+        <w:t xml:space="preserve">Ella se llama Maruxa. Me lo había dicho Ada en la cuesta, y me había dicho también que desde que murió él ya casi nadie la llama así.</w:t>
+      </w:r>
+    </w:p>
+    <w:p>
+      <w:pPr>
+        <w:pStyle w:val="BodyText"/>
+      </w:pPr>
+      <w:r>
         <w:t xml:space="preserve">Me senté donde me dijo. Ada se sentó a mi lado. Su abuela, enfrente.</w:t>
       </w:r>
     </w:p>
@@ -1751,7 +1759,7 @@
         <w:pStyle w:val="BodyText"/>
       </w:pPr>
       <w:r>
-        <w:t xml:space="preserve">Yo estaba al lado, con las manos vacías, y él rodeó mi hombro con el brazo extendido para dársela a Julian por el otro lado, sin rozarme. Lo vi hacerlo. Vi el brazo pasar a un palmo de mi cara, con la manga del chubasquero oliendo a sal, y no tocarme.</w:t>
+        <w:t xml:space="preserve">Yo estaba al lado, con las manos vacías, y él rodeó mi hombro con el brazo extendido para dársela a Julian por el otro lado. Lo vi hacerlo. Vi el brazo pasar junto a mi cara, con la manga del chubasquero oliendo a sal, y no tocarme.</w:t>
       </w:r>
     </w:p>
     <w:p>
@@ -2412,7 +2420,7 @@
         <w:pStyle w:val="BodyText"/>
       </w:pPr>
       <w:r>
-        <w:t xml:space="preserve">Me lo dije muy despacio, apoyada en la pared del recibidor. La cicatriz también estaba en el sueño. Yo la había tocado en el sueño con la palma abierta mientras él me levantaba. Y no se la había visto nunca. Nunca. Hasta ese momento.</w:t>
+        <w:t xml:space="preserve">Me lo dije muy despacio, apoyada en la pared del recibidor. La cicatriz también estaba en el sueño. Yo la había tocado en el sueño con la palma abierta, agarrada a su espalda, mientras él me levantaba. Y no se la había visto nunca. Nunca. Hasta ese momento.</w:t>
       </w:r>
     </w:p>
     <w:p>
@@ -4309,7 +4317,7 @@
         <w:pStyle w:val="BodyText"/>
       </w:pPr>
       <w:r>
-        <w:t xml:space="preserve">Y noté que él hacía lo mismo. Al mismo tiempo. El roce del pantalón contra la pata de la silla. El hueco que se abrió debajo de la mesa, de repente, entre los dos.</w:t>
+        <w:t xml:space="preserve">Y noté que él hacía lo mismo. Al mismo tiempo. El roce del pantalón contra la pata de la silla.</w:t>
       </w:r>
     </w:p>
     <w:p>
@@ -5710,6 +5718,14 @@
       </w:pPr>
       <w:r>
         <w:t xml:space="preserve">Como mi madre.</w:t>
+      </w:r>
+    </w:p>
+    <w:p>
+      <w:pPr>
+        <w:pStyle w:val="BodyText"/>
+      </w:pPr>
+      <w:r>
+        <w:t xml:space="preserve">Mi madre se llama Elisa. Es la hija de mi abuela y de Klaus, y tiene sus ojos grises, como yo. Vive en Santiago, en el piso de siempre, con las persianas a media altura desde hace veinte años. Hablamos los domingos, cinco minutos, del tiempo. Álvaro la conoció en una comida de Navidad. Le cayó muy bien. Supo desde el primer día qué cosas decirle y en qué tono.</w:t>
       </w:r>
     </w:p>
     <w:p>

</xml_diff>